<commit_message>
datalake and lakehouse updated
</commit_message>
<xml_diff>
--- a/day-04-data-architecture/datawarehouse vs datalake vs lakehouse.docx
+++ b/day-04-data-architecture/datawarehouse vs datalake vs lakehouse.docx
@@ -249,6 +249,75 @@
           <w:szCs w:val="40"/>
         </w:rPr>
         <w:t>, schema enforcement, and data versioning ("time travel")—directly on top of low-cost cloud storage in open formats (like Apache Parquet). </w:t>
+      </w:r>
+    </w:p>
+    <w:p>
+      <w:pPr>
+        <w:rPr>
+          <w:rFonts w:ascii="Abadi" w:hAnsi="Abadi"/>
+          <w:sz w:val="40"/>
+          <w:szCs w:val="40"/>
+        </w:rPr>
+      </w:pPr>
+    </w:p>
+    <w:p>
+      <w:pPr>
+        <w:rPr>
+          <w:rFonts w:ascii="Abadi" w:hAnsi="Abadi"/>
+          <w:sz w:val="40"/>
+          <w:szCs w:val="40"/>
+        </w:rPr>
+      </w:pPr>
+    </w:p>
+    <w:p>
+      <w:pPr>
+        <w:rPr>
+          <w:rFonts w:ascii="Abadi" w:hAnsi="Abadi"/>
+          <w:sz w:val="40"/>
+          <w:szCs w:val="40"/>
+        </w:rPr>
+      </w:pPr>
+      <w:r>
+        <w:rPr>
+          <w:rFonts w:ascii="Abadi" w:hAnsi="Abadi"/>
+          <w:sz w:val="40"/>
+          <w:szCs w:val="40"/>
+        </w:rPr>
+        <w:drawing>
+          <wp:inline distT="0" distB="0" distL="0" distR="0" wp14:anchorId="33178B8C" wp14:editId="048A9372">
+            <wp:extent cx="19913600" cy="7023100"/>
+            <wp:effectExtent l="0" t="0" r="0" b="6350"/>
+            <wp:docPr id="704135634" name="Picture 1"/>
+            <wp:cNvGraphicFramePr>
+              <a:graphicFrameLocks xmlns:a="http://schemas.openxmlformats.org/drawingml/2006/main" noChangeAspect="1"/>
+            </wp:cNvGraphicFramePr>
+            <a:graphic xmlns:a="http://schemas.openxmlformats.org/drawingml/2006/main">
+              <a:graphicData uri="http://schemas.openxmlformats.org/drawingml/2006/picture">
+                <pic:pic xmlns:pic="http://schemas.openxmlformats.org/drawingml/2006/picture">
+                  <pic:nvPicPr>
+                    <pic:cNvPr id="704135634" name=""/>
+                    <pic:cNvPicPr/>
+                  </pic:nvPicPr>
+                  <pic:blipFill>
+                    <a:blip r:embed="rId5"/>
+                    <a:stretch>
+                      <a:fillRect/>
+                    </a:stretch>
+                  </pic:blipFill>
+                  <pic:spPr>
+                    <a:xfrm>
+                      <a:off x="0" y="0"/>
+                      <a:ext cx="19915345" cy="7023715"/>
+                    </a:xfrm>
+                    <a:prstGeom prst="rect">
+                      <a:avLst/>
+                    </a:prstGeom>
+                  </pic:spPr>
+                </pic:pic>
+              </a:graphicData>
+            </a:graphic>
+          </wp:inline>
+        </w:drawing>
       </w:r>
     </w:p>
     <w:p/>

</xml_diff>